<commit_message>
test(corpus): drop sensitivity labels and name only the settings removed
Third review of #45. docMetadata/LabelInfo.xml holds a sensitivity label, as the
custom properties may; it is now dropped like them, and one committed document had
it (report-gsa-csp-capabilities, a label with the agency's tenant id). The settings
note names what was removed, so a document with document variables only no longer
claims an attached template. THIRD-PARTY-NOTICES.md spells out every file name, and the
attribution test looks for each. New tests cover the size check of same_package, taking
a document out of its archive and the --check comparison.

Co-Authored-By: Claude Opus 5.5 <noreply@anthropic.com>
</commit_message>
<xml_diff>
--- a/tests/corpus/business/report-gsa-csp-capabilities.docx
+++ b/tests/corpus/business/report-gsa-csp-capabilities.docx
@@ -39426,10 +39426,4 @@
     </a:ext>
   </a:extLst>
 </a:theme>
-</file>
-
-<file path=docMetadata/LabelInfo.xml><?xml version="1.0" encoding="utf-8"?>
-<clbl:labelList xmlns:clbl="http://schemas.microsoft.com/office/2020/mipLabelMetadata">
-  <clbl:label id="{da623df2-7a25-4a8f-b59b-3a3459c1375f}" enabled="1" method="Standard" siteId="{16532572-d567-4d67-8727-f12f7bb6aed3}" contentBits="0" removed="0"/>
-</clbl:labelList>
 </file>
</xml_diff>